<commit_message>
Fix the dashboard command: python -m streamlit run app.py
The bare 'streamlit run app.py' fails on a default Windows Python, because pip
installs streamlit.exe into the interpreter's Scripts directory and that
directory is often not on PATH. The module form needs no PATH entry and uses
the interpreter already running.

This was a documentation failure rather than a tooling one. Every launch during
development went through python -m streamlit or the launch.json entry that does
the same, and the README was written with the bare command because that is the
form the Streamlit docs use, so the one instruction that shipped was the one
nobody had executed. Fixed in the README, requirements.txt, app.py,
scripts/dashboard.py and the revision guide, and verified by running the
documented string exactly as written.
</commit_message>
<xml_diff>
--- a/docs/Team_E_Revision_Guide_Labs_1_to_9.docx
+++ b/docs/Team_E_Revision_Guide_Labs_1_to_9.docx
@@ -12128,7 +12128,7 @@
           <w:sz w:val="19"/>
           <w:szCs w:val="19"/>
         </w:rPr>
-        <w:t xml:space="preserve">streamlit run app.py</w:t>
+        <w:t xml:space="preserve">python -m streamlit run app.py</w:t>
       </w:r>
       <w:r>
         <w:rPr>
@@ -17813,7 +17813,7 @@
                 <w:sz w:val="19"/>
                 <w:szCs w:val="19"/>
               </w:rPr>
-              <w:t xml:space="preserve">streamlit run app.py</w:t>
+              <w:t xml:space="preserve">python -m streamlit run app.py</w:t>
             </w:r>
           </w:p>
         </w:tc>
@@ -17837,7 +17837,7 @@
                 <w:sz w:val="19"/>
                 <w:szCs w:val="19"/>
               </w:rPr>
-              <w:t xml:space="preserve">The dashboard, on localhost:8501.</w:t>
+              <w:t xml:space="preserve">The dashboard, on localhost:8501. The module form needs no PATH entry.</w:t>
             </w:r>
           </w:p>
         </w:tc>

</xml_diff>